<commit_message>
feat(libro): The Quiet Hours - 115.5 pagine, PASSA il controllo target
Espansione completata (opzione A): trama invariata, capitoli arricchiti da
~1050 a ~1450 parole medie. Aggiunti: la lista nascosta dei 41 dettagli, le
chiavi mai ritrovate, il fascicolo di Ferrante trovata in carreggiata, il
gesto dei capelli nel video di sorveglianza, gli scarponi comprati alle 4:51
del mattino, il '?' inviato a Nina in risposta a un messaggio che non c'e'
piu', le 12 parole dette in auto prima della frase finale, il perche' Elena
non chiamo' i soccorsi in tre parti oneste, l'udienza al consiglio
dell'ordine, e le misure pratiche del dopo (le chiavi date ad Adrian, il
chiavistello alto, mai piu' turni di notte).

VERIFICATO: assembla ora ESCE 0 - 34.636 parole = 115.5 pagine, dentro il
target 34.500-37.500. Manca solo la copertina per il pacchetto finale.

Co-Authored-By: Claude Opus 5 <noreply@anthropic.com>
</commit_message>
<xml_diff>
--- a/company/Ecosistemi/02-INFO-BUSINESS/Workflow/libri-performanti-multiagente/LIBRI/in_lavorazione/the-quiet-hours/The_Quiet_Hours.docx
+++ b/company/Ecosistemi/02-INFO-BUSINESS/Workflow/libri-performanti-multiagente/LIBRI/in_lavorazione/the-quiet-hours/The_Quiet_Hours.docx
@@ -77,11 +77,61 @@
     </w:p>
     <w:p>
       <w:r>
+        <w:t>There's a fourth explanation and I don't look at it directly, the way you don't look directly at the sun or at a bill you haven't opened. The fourth explanation is that I put it there.</w:t>
+      </w:r>
+    </w:p>
+    <w:p>
+      <w:r>
         <w:t>I put the key on the shelf next to the kettle, where lost things go, and I go start my rounds.</w:t>
       </w:r>
     </w:p>
     <w:p>
       <w:r>
+        <w:t>The rounds are the same rounds. I want to describe them properly, because the ordinariness matters — because everything that comes after has to be laid on top of eight hours of a job I have done four nights a week for eleven years and can do with my hands while my head is somewhere else entirely.</w:t>
+      </w:r>
+    </w:p>
+    <w:p>
+      <w:r>
+        <w:t>Room 3, Mrs. Duffy, hip replacement six weeks ago, sleeping on her back with her mouth open and one hand up by her ear like a child. Room 5, empty since Tuesday, stripped bed, and I still look in. Room 7, Mr. Aldridge, awake.</w:t>
+      </w:r>
+    </w:p>
+    <w:p>
+      <w:r>
+        <w:t>"What year is it?"</w:t>
+      </w:r>
+    </w:p>
+    <w:p>
+      <w:r>
+        <w:t>"It's 2026, love."</w:t>
+      </w:r>
+    </w:p>
+    <w:p>
+      <w:r>
+        <w:t>"Is it." He takes this the way he always takes it, with the small tired courtesy of a man who has been given a wrong answer by a competent person. "I thought it was earlier than that."</w:t>
+      </w:r>
+    </w:p>
+    <w:p>
+      <w:r>
+        <w:t>"You're not the only one."</w:t>
+      </w:r>
+    </w:p>
+    <w:p>
+      <w:r>
+        <w:t>Room 9, the Kelly sisters, who are not sisters and who have insisted on being roomed together for two years and hold hands in their sleep across the gap between the beds. Room 11, Mr. Osei, who does not sleep either and who has read four hundred pages of the same Wilbur Smith since January and who lifts a hand to me without looking up.</w:t>
+      </w:r>
+    </w:p>
+    <w:p>
+      <w:r>
+        <w:t>This is the part of the job nobody writes about. It's not dramatic. It's eleven people breathing in eleven rooms and one woman walking between them making sure they keep doing it.</w:t>
+      </w:r>
+    </w:p>
+    <w:p>
+      <w:r>
+        <w:t>I love it. I've never once said that out loud to anyone.</w:t>
+      </w:r>
+    </w:p>
+    <w:p>
+      <w:r>
         <w:t>Room 12 rings at eleven forty. Mrs. Ferrante is awake and sitting up, hands folded on the blanket like she's waiting for a train.</w:t>
       </w:r>
     </w:p>
@@ -118,6 +168,86 @@
     <w:p>
       <w:r>
         <w:t>I write it in the log. *Patient briefly disoriented, settled without medication, 23:52.*</w:t>
+      </w:r>
+    </w:p>
+    <w:p>
+      <w:r>
+        <w:t>What I don't write in the log is that Marguerite Ferrante has said *you're early* to me every night for eleven months, and that in eleven months I have never once asked her early for what.</w:t>
+      </w:r>
+    </w:p>
+    <w:p>
+      <w:r>
+        <w:t>That's not true. I asked her once, in April. She said something I didn't catch and I let it go because there was a fall in room 5 and by the time I came back she was asleep.</w:t>
+      </w:r>
+    </w:p>
+    <w:p>
+      <w:r>
+        <w:t>I have thought about that unheard sentence perhaps forty times since.</w:t>
+      </w:r>
+    </w:p>
+    <w:p>
+      <w:r>
+        <w:t>---</w:t>
+      </w:r>
+    </w:p>
+    <w:p>
+      <w:r>
+        <w:t>The middle of a night shift has a shape. Between one and three you do the paperwork nobody does in daylight — the audits, the fridge temperatures, the controlled drugs count that takes two signatures and eleven minutes and which Angela and I have done together so many times we no longer speak during it.</w:t>
+      </w:r>
+    </w:p>
+    <w:p>
+      <w:r>
+        <w:t>Tonight Angela is on the other wing, so I do the count with Priya, who is on her third week of nights and still thinks they're interesting.</w:t>
+      </w:r>
+    </w:p>
+    <w:p>
+      <w:r>
+        <w:t>"Does it get boring?" she asks, while I'm reading numbers off a blister pack.</w:t>
+      </w:r>
+    </w:p>
+    <w:p>
+      <w:r>
+        <w:t>"Yes."</w:t>
+      </w:r>
+    </w:p>
+    <w:p>
+      <w:r>
+        <w:t>"Everyone says the nights are peaceful."</w:t>
+      </w:r>
+    </w:p>
+    <w:p>
+      <w:r>
+        <w:t>"Everyone who says that works days."</w:t>
+      </w:r>
+    </w:p>
+    <w:p>
+      <w:r>
+        <w:t>She laughs. She has a good laugh, unguarded, the laugh of someone who has not yet had a phone call at ten past one in the morning.</w:t>
+      </w:r>
+    </w:p>
+    <w:p>
+      <w:r>
+        <w:t>"Can I ask you something?" she says. "Why nights? You could do days. You've got the seniority, Denise would have you on days tomorrow."</w:t>
+      </w:r>
+    </w:p>
+    <w:p>
+      <w:r>
+        <w:t>I count out four ampoules and write the number in the column.</w:t>
+      </w:r>
+    </w:p>
+    <w:p>
+      <w:r>
+        <w:t>"I like knowing where everybody is," I say.</w:t>
+      </w:r>
+    </w:p>
+    <w:p>
+      <w:r>
+        <w:t>It's the truest answer I've given anybody in fourteen months and she takes it for a joke, and laughs again, and I let her.</w:t>
+      </w:r>
+    </w:p>
+    <w:p>
+      <w:r>
+        <w:t>---</w:t>
       </w:r>
     </w:p>
     <w:p>
@@ -351,6 +481,56 @@
     </w:p>
     <w:p>
       <w:r>
+        <w:t>There's a thing I do that I have never told the counselling woman about, and it is this: I keep a list.</w:t>
+      </w:r>
+    </w:p>
+    <w:p>
+      <w:r>
+        <w:t>It's in the notes app on my phone, and it's called *Groceries*, which is a level of cowardice I'm aware of. It has forty-one items on it. They are all the things about that night that don't sit right.</w:t>
+      </w:r>
+    </w:p>
+    <w:p>
+      <w:r>
+        <w:t>Item one: *she said see you at Mum's — we weren't going to Mum's until the 23rd.*</w:t>
+      </w:r>
+    </w:p>
+    <w:p>
+      <w:r>
+        <w:t>Item four: *nobody at the party remembers her leaving.*</w:t>
+      </w:r>
+    </w:p>
+    <w:p>
+      <w:r>
+        <w:t>Item eleven: *the taxi.*</w:t>
+      </w:r>
+    </w:p>
+    <w:p>
+      <w:r>
+        <w:t>Item nineteen: *why did she park at the ring road that morning.*</w:t>
+      </w:r>
+    </w:p>
+    <w:p>
+      <w:r>
+        <w:t>Item thirty-three: *her keys.*</w:t>
+      </w:r>
+    </w:p>
+    <w:p>
+      <w:r>
+        <w:t>Nina's house keys were never found. Not in the car, not in the water, not on the verge, not in the bag they gave my mother in a plastic envelope with a form to sign. Her phone was there. Her purse was there, with forty pounds in it and a receipt from a garage. Her keys, on the ring with the enamel puffin she bought in Reykjavik and would not shut up about, were not.</w:t>
+      </w:r>
+    </w:p>
+    <w:p>
+      <w:r>
+        <w:t>I asked about it twice. The first time a very young officer said things move about in an impact, which is true. The second time, six weeks later, a different officer said they'd have been logged if they'd been recovered, which is also true, and which is not an answer to the question I was asking.</w:t>
+      </w:r>
+    </w:p>
+    <w:p>
+      <w:r>
+        <w:t>Item forty-one is the newest and it says: *2:14.*</w:t>
+      </w:r>
+    </w:p>
+    <w:p>
+      <w:r>
         <w:t>I take out my laptop and I search *voicemail delayed delivery fourteen months* and I read forum posts by people who are angry at telecom companies. It happens, apparently. Carrier faults. Messages that sit in a queue on a server for weeks. I find one case where a man received a voicemail six months late.</w:t>
       </w:r>
     </w:p>
@@ -565,6 +745,56 @@
     </w:p>
     <w:p>
       <w:r>
+        <w:t>Here is the thing about my sister that I have never managed to explain to anybody who didn't know her, and that I need you to understand or none of the rest of this will make sense.</w:t>
+      </w:r>
+    </w:p>
+    <w:p>
+      <w:r>
+        <w:t>Nina was five years younger and had been in charge of me since she was about nine.</w:t>
+      </w:r>
+    </w:p>
+    <w:p>
+      <w:r>
+        <w:t>That's not a figure of speech. When our father left — I was fourteen, she was nine — I did the sensible things: I got the bus timetables sorted, I learned to do a shepherd's pie, I filled in the forms. And Nina walked into the kitchen one evening about three weeks in, at nine years old, and said, "You're being weird. You've stopped being annoying and it's worse."</w:t>
+      </w:r>
+    </w:p>
+    <w:p>
+      <w:r>
+        <w:t>I have thought about that sentence for twenty years. Nine years old.</w:t>
+      </w:r>
+    </w:p>
+    <w:p>
+      <w:r>
+        <w:t>She was the only person alive who could tell me a true thing about myself and have me actually hear it. Everybody else, I'd be composing the rebuttal before they finished. With her, it just went in.</w:t>
+      </w:r>
+    </w:p>
+    <w:p>
+      <w:r>
+        <w:t>Which is exactly why, when she sat on my sofa on the eleventh of December with a glass in both hands and asked me a question in the careful way she asked it, I made a joke.</w:t>
+      </w:r>
+    </w:p>
+    <w:p>
+      <w:r>
+        <w:t>I've had fourteen months to work out why, and I think it's this: it was the first time in twenty years the direction of travel had reversed. She was asking me for something. And I didn't have any equipment for it, so I reached for the thing I did have, which was being funny at her.</w:t>
+      </w:r>
+    </w:p>
+    <w:p>
+      <w:r>
+        <w:t>*Both. In that order. Obviously.*</w:t>
+      </w:r>
+    </w:p>
+    <w:p>
+      <w:r>
+        <w:t>She laughed. She let me off.</w:t>
+      </w:r>
+    </w:p>
+    <w:p>
+      <w:r>
+        <w:t>I have never been let off anything so completely in my life.</w:t>
+      </w:r>
+    </w:p>
+    <w:p>
+      <w:r>
         <w:t>The doorbell goes at four.</w:t>
       </w:r>
     </w:p>
@@ -889,6 +1119,36 @@
     </w:p>
     <w:p>
       <w:r>
+        <w:t>There's a photograph on her desk, angled away from me. I can see the back of the frame and about a centimetre of the edge of the picture, and I catch myself trying to work out from that centimetre whether it's children or a dog.</w:t>
+      </w:r>
+    </w:p>
+    <w:p>
+      <w:r>
+        <w:t>She notices me noticing.</w:t>
+      </w:r>
+    </w:p>
+    <w:p>
+      <w:r>
+        <w:t>"Two boys," she says. "Nineteen and twenty-two. The nineteen-year-old is currently informing me that university is a scam."</w:t>
+      </w:r>
+    </w:p>
+    <w:p>
+      <w:r>
+        <w:t>"Is it?"</w:t>
+      </w:r>
+    </w:p>
+    <w:p>
+      <w:r>
+        <w:t>"Increasingly." She almost smiles. "I turn it round because people talk more freely at a desk that isn't showing them somebody else's family. You'd be surprised how many people stop halfway through a sentence when they see a photograph of a child."</w:t>
+      </w:r>
+    </w:p>
+    <w:p>
+      <w:r>
+        <w:t>I file that away as the first honest piece of technique anybody in this building has ever shown me.</w:t>
+      </w:r>
+    </w:p>
+    <w:p>
+      <w:r>
         <w:t>I sit with my hands around a plastic cup of the worst coffee in the county and I ask the question I came to ask, and I ask it badly.</w:t>
       </w:r>
     </w:p>
@@ -959,7 +1219,42 @@
     </w:p>
     <w:p>
       <w:r>
-        <w:t>"You didn't ask," Okonjo says, and it isn't cruel, it's just true, and it lands like something dropped from a height. "You told me she was fine when she left. You told me twice. You told me she hugged you at the door and said *see you at Mum's*, and then you told me you were at home all night, and I believed you, and I still do." A pause, the exact length of a held breath. "You never once asked me what happened in between."</w:t>
+        <w:t>"You didn't ask," Okonjo says, and it isn't cruel, it's just true, and it lands like something dropped from a height.</w:t>
+      </w:r>
+    </w:p>
+    <w:p>
+      <w:r>
+        <w:t>I sit with it.</w:t>
+      </w:r>
+    </w:p>
+    <w:p>
+      <w:r>
+        <w:t>"That can't be right," I say. "I asked hundreds of questions. I rang this building so often the woman on the front desk knew my voice."</w:t>
+      </w:r>
+    </w:p>
+    <w:p>
+      <w:r>
+        <w:t>"You did." She doesn't look away. "You asked whether the barrier had been maintained. You asked about the road surface. You asked twice about the drainage, and I got a man from the council to send me a survey, and I sent it to you, and you rang back with a question about the camber."</w:t>
+      </w:r>
+    </w:p>
+    <w:p>
+      <w:r>
+        <w:t>"Because those were the things that—"</w:t>
+      </w:r>
+    </w:p>
+    <w:p>
+      <w:r>
+        <w:t>"They were all questions about the *road*," she says. "Not one of them was a question about your sister. In fourteen months you have never once asked me what state she was in when she left that party, or who she spoke to, or where she went for thirty-one minutes."</w:t>
+      </w:r>
+    </w:p>
+    <w:p>
+      <w:r>
+        <w:t>The clock on her wall does its thing.</w:t>
+      </w:r>
+    </w:p>
+    <w:p>
+      <w:r>
+        <w:t>"I've watched a lot of families do this," she says, more gently. "Everybody has a question they don't ask. Usually it's *did she suffer*. That one I understand." She turns her mug. "Yours isn't that one. Yours is a whole half hour, and I've been waiting fourteen months for you to notice it's missing." "You told me she was fine when she left. You told me twice. You told me she hugged you at the door and said *see you at Mum's*, and then you told me you were at home all night, and I believed you, and I still do." A pause, the exact length of a held breath. "You never once asked me what happened in between."</w:t>
       </w:r>
     </w:p>
     <w:p>
@@ -1163,6 +1458,56 @@
     </w:p>
     <w:p>
       <w:r>
+        <w:t>There's more in the file, and I read all of it, sitting on a plastic chair in a room that smells of toner at twenty past three in the morning.</w:t>
+      </w:r>
+    </w:p>
+    <w:p>
+      <w:r>
+        <w:t>Her admission was expedited. That's unusual — the waiting list at Ridgemont runs eleven months and people die on it. Marguerite Ferrante went from referral to bed in nine days, and the reason is in a social work note dated the second of March last year:</w:t>
+      </w:r>
+    </w:p>
+    <w:p>
+      <w:r>
+        <w:t>*Mrs F unable to remain at current address. Repeated night-time wandering, on two occasions found on the carriageway. Neighbour intervention. Risk assessed as high, immediate placement sought.*</w:t>
+      </w:r>
+    </w:p>
+    <w:p>
+      <w:r>
+        <w:t>On two occasions found on the carriageway.</w:t>
+      </w:r>
+    </w:p>
+    <w:p>
+      <w:r>
+        <w:t>I read it three times.</w:t>
+      </w:r>
+    </w:p>
+    <w:p>
+      <w:r>
+        <w:t>An eighty-two-year-old woman with dementia, who lived four hundred metres from a bend where my sister died, was walking out onto that road at night, repeatedly, in the months afterward.</w:t>
+      </w:r>
+    </w:p>
+    <w:p>
+      <w:r>
+        <w:t>There's a second note, from a different hand, undated:</w:t>
+      </w:r>
+    </w:p>
+    <w:p>
+      <w:r>
+        <w:t>*Family GP reports Mrs F has become preoccupied with a road traffic incident in the vicinity of her property (Dec, previous year). Discussed with daughter of neighbour — no family of her own. Reassurance given. Preoccupation likely fixation secondary to cognitive decline; content not reality-based.*</w:t>
+      </w:r>
+    </w:p>
+    <w:p>
+      <w:r>
+        <w:t>*Content not reality-based.*</w:t>
+      </w:r>
+    </w:p>
+    <w:p>
+      <w:r>
+        <w:t>Somebody wrote that sentence about a woman who had stood at her gate in a dressing gown and heard it happen.</w:t>
+      </w:r>
+    </w:p>
+    <w:p>
+      <w:r>
         <w:t>I put the file back. I finish my rounds. I chart everything I'm meant to chart and nothing I'm not.</w:t>
       </w:r>
     </w:p>
@@ -1377,6 +1722,46 @@
     </w:p>
     <w:p>
       <w:r>
+        <w:t>"You'll want to know about the Leeds one," he says, without turning round, which is how I learn that Ken Boyd has been building to this for half an hour.</w:t>
+      </w:r>
+    </w:p>
+    <w:p>
+      <w:r>
+        <w:t>"Go on."</w:t>
+      </w:r>
+    </w:p>
+    <w:p>
+      <w:r>
+        <w:t>"Girl of nineteen. Answerphone message, forty seconds, family said it was her, police said it wasn't." He drags something across the screen. "It was her. Took me a week. And when I told the mother, she asked me a question I've never got over, which was: *does that mean it's my fault I didn't pick up?*"</w:t>
+      </w:r>
+    </w:p>
+    <w:p>
+      <w:r>
+        <w:t>The garage hums. Somewhere out the back a boiler fires.</w:t>
+      </w:r>
+    </w:p>
+    <w:p>
+      <w:r>
+        <w:t>"What did you tell her?"</w:t>
+      </w:r>
+    </w:p>
+    <w:p>
+      <w:r>
+        <w:t>"I told her I do sound, not fault." He shrugs, one shoulder. "Which was a cowardly answer and I've had thirty years to think of a better one and I haven't." He glances at me sideways. "You'll ask me that question at some point. Not today. But you will, and I want you to know in advance that I'm going to give you the same cowardly answer, because it's the only true one I've got."</w:t>
+      </w:r>
+    </w:p>
+    <w:p>
+      <w:r>
+        <w:t>"I wasn't going to ask you anything."</w:t>
+      </w:r>
+    </w:p>
+    <w:p>
+      <w:r>
+        <w:t>"No," Ken agrees, pleasantly. "Nobody ever is."</w:t>
+      </w:r>
+    </w:p>
+    <w:p>
+      <w:r>
         <w:t>"Right," he says at last. "Two things. Then a third thing, and you're going to want to sit down for the third thing, except you're already sitting down, so."</w:t>
       </w:r>
     </w:p>
@@ -1513,6 +1898,41 @@
     <w:p>
       <w:r>
         <w:t>---</w:t>
+      </w:r>
+    </w:p>
+    <w:p>
+      <w:r>
+        <w:t>Before I leave, Ken says: "One more thing and then I'll let you go."</w:t>
+      </w:r>
+    </w:p>
+    <w:p>
+      <w:r>
+        <w:t>He's turned off the monitor. That's deliberate; I notice it and I appreciate it.</w:t>
+      </w:r>
+    </w:p>
+    <w:p>
+      <w:r>
+        <w:t>"The gate on that recording. The compression." He rubs the back of his neck. "I said anything quiet gets thrown away. That's true. But there's a bit at the very end, after your three syllables, about a second and a half, where the noise floor changes."</w:t>
+      </w:r>
+    </w:p>
+    <w:p>
+      <w:r>
+        <w:t>"Changes how?"</w:t>
+      </w:r>
+    </w:p>
+    <w:p>
+      <w:r>
+        <w:t>"It gets *quieter*." He shrugs, uncomfortable. "Which happens when a phone is moved away from a source of noise. Or when a car door shuts."</w:t>
+      </w:r>
+    </w:p>
+    <w:p>
+      <w:r>
+        <w:t>"So she got out of the car."</w:t>
+      </w:r>
+    </w:p>
+    <w:p>
+      <w:r>
+        <w:t>"Or somebody else got in," says Ken Boyd. "Or she put the phone down. Or she moved her arm. That's the honest end of it and I'd like you to hold on to the honest end, because you've got the look of somebody who's about to build a house on eleven seconds."</w:t>
       </w:r>
     </w:p>
     <w:p>
@@ -1756,6 +2176,26 @@
     </w:p>
     <w:p>
       <w:r>
+        <w:t>I stand in the gravel behind a storage facility that used to be a garden centre and I think about the fact that I have driven past this place three hundred times.</w:t>
+      </w:r>
+    </w:p>
+    <w:p>
+      <w:r>
+        <w:t>Three hundred times, minimum. Every trip to my mother's goes this way. Every trip to the retail park. The Kesselwood road is not a road I avoid; it's the road, the one everybody in this town uses, and in fourteen months I have gone past that bend perhaps a hundred and fifty times and I have never once stopped.</w:t>
+      </w:r>
+    </w:p>
+    <w:p>
+      <w:r>
+        <w:t>I've always been slightly proud of that. In a grim way. *I don't do the shrine thing. I don't put flowers on a verge. I drive past at forty like a person with a life.*</w:t>
+      </w:r>
+    </w:p>
+    <w:p>
+      <w:r>
+        <w:t>Standing in the gravel it occurs to me for the first time that not stopping is not the same as being all right about it, and that a woman who arranges never to slow down on a particular stretch of B road has arranged something.</w:t>
+      </w:r>
+    </w:p>
+    <w:p>
+      <w:r>
         <w:t>---</w:t>
       </w:r>
     </w:p>
@@ -1812,6 +2252,16 @@
     <w:p>
       <w:r>
         <w:t>"I've been," he says. "It's genuinely terrible. Yes."</w:t>
+      </w:r>
+    </w:p>
+    <w:p>
+      <w:r>
+        <w:t>The Ring has a carpet that was chosen in about 1988 by somebody who has since apologised. There are four people in it and two of them are the same man in a mirror. The barmaid puts my drink down and says "you all right?" in the way that is not a question.</w:t>
+      </w:r>
+    </w:p>
+    <w:p>
+      <w:r>
+        <w:t>I have not been in a pub in fourteen months. I notice this at the exact moment I sit down, the way you notice a tooth.</w:t>
       </w:r>
     </w:p>
     <w:p>
@@ -2075,6 +2525,66 @@
     </w:p>
     <w:p>
       <w:r>
+        <w:t>I make myself watch it properly this time, the way I'd watch a patient's gait — clinically, looking for the tell.</w:t>
+      </w:r>
+    </w:p>
+    <w:p>
+      <w:r>
+        <w:t>The woman comes out of the stairwell at a normal walking pace. Her arms swing. She is not shuffling and she is not gliding and she does not have her hands out in front of her like the thing people do in films.</w:t>
+      </w:r>
+    </w:p>
+    <w:p>
+      <w:r>
+        <w:t>At the door she stops. Square on. Both feet.</w:t>
+      </w:r>
+    </w:p>
+    <w:p>
+      <w:r>
+        <w:t>And then, at about the ninety-second mark, she does something that puts a cold line straight down my spine.</w:t>
+      </w:r>
+    </w:p>
+    <w:p>
+      <w:r>
+        <w:t>She reaches up with her right hand and tucks a piece of hair behind her ear.</w:t>
+      </w:r>
+    </w:p>
+    <w:p>
+      <w:r>
+        <w:t>It's nothing. It's a thing I do forty times a day. It's a thing I have done since I was eleven years old and my mother told me to stop.</w:t>
+      </w:r>
+    </w:p>
+    <w:p>
+      <w:r>
+        <w:t>It is also, categorically, not a thing a body does on autopilot in the middle of a non-REM parasomnia, because it is not walking or standing or opening a door. It's a small vain fussy gesture made by a person who is aware of herself in a room.</w:t>
+      </w:r>
+    </w:p>
+    <w:p>
+      <w:r>
+        <w:t>"Bernie," I say. "Can you go back thirty seconds and let it run without me talking?"</w:t>
+      </w:r>
+    </w:p>
+    <w:p>
+      <w:r>
+        <w:t>He does.</w:t>
+      </w:r>
+    </w:p>
+    <w:p>
+      <w:r>
+        <w:t>I watch the woman on the screen tuck her hair behind her ear at 02:48:31 on the fourteenth of February, on a floor that has been closed since November, outside a room that has been stripped to the boards.</w:t>
+      </w:r>
+    </w:p>
+    <w:p>
+      <w:r>
+        <w:t>And then — and this is the part I do not tell Bernie, or Okonjo, or anybody, for another five weeks — she turns her head very slightly toward the camera.</w:t>
+      </w:r>
+    </w:p>
+    <w:p>
+      <w:r>
+        <w:t>Not to it. Past it. The way you glance at something you already know is there.</w:t>
+      </w:r>
+    </w:p>
+    <w:p>
+      <w:r>
         <w:t>I watch myself walk out of the stairwell and stop in front of a door on a floor that has been closed for four months, and stand there without moving for six minutes and eleven seconds, and then walk away.</w:t>
       </w:r>
     </w:p>
@@ -2349,6 +2859,46 @@
     </w:p>
     <w:p>
       <w:r>
+        <w:t>I sit with her until she goes under, which takes a long time, and while I sit there I do something I have not done in fourteen months, which is to think about it as a nurse.</w:t>
+      </w:r>
+    </w:p>
+    <w:p>
+      <w:r>
+        <w:t>Not as a sister. As the person who would be called if it happened in front of me.</w:t>
+      </w:r>
+    </w:p>
+    <w:p>
+      <w:r>
+        <w:t>A vehicle leaves the road at speed and enters water. The occupant is unrestrained or restrained. The mechanism of injury is deceleration — the body stops when the car stops, and the organs inside the body stop a fraction of a second later, and that fraction is what kills people.</w:t>
+      </w:r>
+    </w:p>
+    <w:p>
+      <w:r>
+        <w:t>There is a version of that where a person is alive for twenty minutes and drowns.</w:t>
+      </w:r>
+    </w:p>
+    <w:p>
+      <w:r>
+        <w:t>There is a version where a person is not alive at the moment the noise stops.</w:t>
+      </w:r>
+    </w:p>
+    <w:p>
+      <w:r>
+        <w:t>I have known both versions existed since the day it happened, and I have made myself not look at which one applied, and I have told myself that was because it didn't matter, and sitting in a chair beside an old woman at four in the morning I understand with complete clarity that it was because of the torch.</w:t>
+      </w:r>
+    </w:p>
+    <w:p>
+      <w:r>
+        <w:t>Somebody was down there before the ambulance.</w:t>
+      </w:r>
+    </w:p>
+    <w:p>
+      <w:r>
+        <w:t>If the first version is the true one, then somebody stood at that barrier while my sister was alive in the water and did not go down.</w:t>
+      </w:r>
+    </w:p>
+    <w:p>
+      <w:r>
         <w:t>I get through the rest of the shift. I don't know how; the hands do it.</w:t>
       </w:r>
     </w:p>
@@ -2638,7 +3188,112 @@
     </w:p>
     <w:p>
       <w:r>
+        <w:t>I put the cup down.</w:t>
+      </w:r>
+    </w:p>
+    <w:p>
+      <w:r>
+        <w:t>"Can I say something you're not going to like?"</w:t>
+      </w:r>
+    </w:p>
+    <w:p>
+      <w:r>
+        <w:t>"You can say anything you like. I'm a police officer, it's mostly what happens to me."</w:t>
+      </w:r>
+    </w:p>
+    <w:p>
+      <w:r>
+        <w:t>"You keep telling me what you can't do." My voice comes out steadier than I expect. "You can't reopen it. You can't tie a data connection to a person. You can't use a witness with a diagnosis. You've told me four things you can't do and one thing you can, which was give me the number of a retired man with a cat."</w:t>
+      </w:r>
+    </w:p>
+    <w:p>
+      <w:r>
+        <w:t>Okonjo doesn't move.</w:t>
+      </w:r>
+    </w:p>
+    <w:p>
+      <w:r>
+        <w:t>"And I understand all of it," I say. "I work in a system too. I know what *no resource* looks like from the inside, I know it isn't personal, I know there's a woman on your desk right now who's alive and needs you more than my sister does. I'm not asking you to be a better police officer."</w:t>
+      </w:r>
+    </w:p>
+    <w:p>
+      <w:r>
+        <w:t>"Then what are you asking?"</w:t>
+      </w:r>
+    </w:p>
+    <w:p>
+      <w:r>
+        <w:t>"I'm asking whether *you* think something happened."</w:t>
+      </w:r>
+    </w:p>
+    <w:p>
+      <w:r>
+        <w:t>The plant on the windowsill has three dead leaves at the bottom that nobody has picked off.</w:t>
+      </w:r>
+    </w:p>
+    <w:p>
+      <w:r>
+        <w:t>"Yes," Ruth Okonjo says.</w:t>
+      </w:r>
+    </w:p>
+    <w:p>
+      <w:r>
+        <w:t>It is the first straight answer I have had from anybody in fourteen months and it goes through me like cold water.</w:t>
+      </w:r>
+    </w:p>
+    <w:p>
+      <w:r>
+        <w:t>"Since when?"</w:t>
+      </w:r>
+    </w:p>
+    <w:p>
+      <w:r>
+        <w:t>"Since about eleven minutes into the second time I interviewed you," she says. "And I want to be careful now, because there's a difference between a thing I think and a thing I know, and if I blur it for you I'll do more harm than good." She meets my eyes. "I have thought something was wrong with that file since February of last year. I have not been able to find it. Those are two separate facts and you'll want to weld them together, and I'd ask you not to."</w:t>
+      </w:r>
+    </w:p>
+    <w:p>
+      <w:r>
         <w:t>---</w:t>
+      </w:r>
+    </w:p>
+    <w:p>
+      <w:r>
+        <w:t>On the way out she stops at the front desk and asks the civilian on duty for a form, and fills in three lines of it standing up, and I watch her do it without understanding what I'm watching.</w:t>
+      </w:r>
+    </w:p>
+    <w:p>
+      <w:r>
+        <w:t>"What's that?"</w:t>
+      </w:r>
+    </w:p>
+    <w:p>
+      <w:r>
+        <w:t>"Referral," she says, not looking up. "Victim support. You're entitled to it and you should have been offered it fourteen months ago and I've just checked and you weren't, because the file was closed as accidental and accidental deaths fall down a gap."</w:t>
+      </w:r>
+    </w:p>
+    <w:p>
+      <w:r>
+        <w:t>"I don't want—"</w:t>
+      </w:r>
+    </w:p>
+    <w:p>
+      <w:r>
+        <w:t>"I know you don't want it." She signs the bottom. "They'll ring you. You can tell them to get lost, and that's your business, but the offer will have been made and it'll be on the system that it was made, and if in eight months you change your mind you won't have to start from nothing."</w:t>
+      </w:r>
+    </w:p>
+    <w:p>
+      <w:r>
+        <w:t>She hands the form over the desk.</w:t>
+      </w:r>
+    </w:p>
+    <w:p>
+      <w:r>
+        <w:t>"That's not detective work," I say.</w:t>
+      </w:r>
+    </w:p>
+    <w:p>
+      <w:r>
+        <w:t>"No," Okonjo agrees. "That's the job, though."</w:t>
       </w:r>
     </w:p>
     <w:p>
@@ -2882,6 +3537,41 @@
     </w:p>
     <w:p>
       <w:r>
+        <w:t>Before I open anything I sit there and I do the thing I have been trained to do, which is to think about who else could have done this.</w:t>
+      </w:r>
+    </w:p>
+    <w:p>
+      <w:r>
+        <w:t>It's a short list and I make myself walk it.</w:t>
+      </w:r>
+    </w:p>
+    <w:p>
+      <w:r>
+        <w:t>My mother. Who has not driven at night since 2011 and who would have had to get a key cut, rent a locker in a record shop, and write sixty pages in my handwriting.</w:t>
+      </w:r>
+    </w:p>
+    <w:p>
+      <w:r>
+        <w:t>Adrian. Who I have known five weeks and who could not have written entries dated last January.</w:t>
+      </w:r>
+    </w:p>
+    <w:p>
+      <w:r>
+        <w:t>Somebody who knew Nina. Same problem: the handwriting.</w:t>
+      </w:r>
+    </w:p>
+    <w:p>
+      <w:r>
+        <w:t>That's the wall I keep hitting and have been hitting since the second page. It isn't a handwriting *like* mine. There is a loop on my lowercase g that my old ward sister used to take the mickey out of, an actual physical habit I have had since I was seven, and it is on every page.</w:t>
+      </w:r>
+    </w:p>
+    <w:p>
+      <w:r>
+        <w:t>So the list has one name on it, and I have known that since I sat down, and everything I have been doing for the last four minutes is a way of not turning round.</w:t>
+      </w:r>
+    </w:p>
+    <w:p>
+      <w:r>
         <w:t>The shoebox first.</w:t>
       </w:r>
     </w:p>
@@ -2968,6 +3658,71 @@
     <w:p>
       <w:r>
         <w:t>Page after page. Dates through the winter and spring and summer of last year, into the autumn, into January of this one. Some entries are three lines. Some run over. All of them are mine, and I have no memory — not a fragment, not a shadow — of writing a single word.</w:t>
+      </w:r>
+    </w:p>
+    <w:p>
+      <w:r>
+        <w:t>I sit on that floor and I read for a long time, and what gets me is not the content.</w:t>
+      </w:r>
+    </w:p>
+    <w:p>
+      <w:r>
+        <w:t>It's the handwriting on page forty.</w:t>
+      </w:r>
+    </w:p>
+    <w:p>
+      <w:r>
+        <w:t>Because on page forty the writing changes. Not the hand — it's still mine — but the *pressure*. Up to page thirty-nine everything is written in the neat, small, slightly cramped way I write notes at work, the way you write when you might have to read it back to a coroner.</w:t>
+      </w:r>
+    </w:p>
+    <w:p>
+      <w:r>
+        <w:t>From page forty on, the pen goes through the paper in places.</w:t>
+      </w:r>
+    </w:p>
+    <w:p>
+      <w:r>
+        <w:t>&gt; **11 September.** *Went again. Stood at the gate for an hour. A car stopped and a man got out and I went back to the car before he could get to me. I don't know who he was. I don't like that I don't know who he was.*</w:t>
+      </w:r>
+    </w:p>
+    <w:p>
+      <w:r>
+        <w:t>She knew. Some version of me, on that road, in September, saw Adrian Cole get out of a car and made a decision to leave before he reached her.</w:t>
+      </w:r>
+    </w:p>
+    <w:p>
+      <w:r>
+        <w:t>And then went home and got into bed and woke up and did not know it.</w:t>
+      </w:r>
+    </w:p>
+    <w:p>
+      <w:r>
+        <w:t>&gt; **14 September.** *If someone stops me I'll have to explain and I can't explain. Stop going. STOP GOING.*</w:t>
+      </w:r>
+    </w:p>
+    <w:p>
+      <w:r>
+        <w:t>&gt; **19 September.** *Went.*</w:t>
+      </w:r>
+    </w:p>
+    <w:p>
+      <w:r>
+        <w:t>I have to put the notebook down for a minute at that point. I sit in a storeroom that smells of dust and cardboard with my hand over my mouth.</w:t>
+      </w:r>
+    </w:p>
+    <w:p>
+      <w:r>
+        <w:t>*Stop going. STOP GOING.*</w:t>
+      </w:r>
+    </w:p>
+    <w:p>
+      <w:r>
+        <w:t>*Went.*</w:t>
+      </w:r>
+    </w:p>
+    <w:p>
+      <w:r>
+        <w:t>The most frightening thing in that notebook is not that a stranger wrote it. It's that she and I are exactly the same woman: she made a rule, in capitals, for her own good, and then broke it five days later, and wrote down that she'd broken it, in the same flat voice I use for everything.</w:t>
       </w:r>
     </w:p>
     <w:p>
@@ -3111,6 +3866,26 @@
     </w:p>
     <w:p>
       <w:r>
+        <w:t>There's one from March that is four pages long and is a letter to her, and I read half of it and stop, because it is addressed to *N* and it says *I keep doing the thing where I compose the text before I remember,* and I have done that thing perhaps two hundred times awake and had no idea I did it asleep as well.</w:t>
+      </w:r>
+    </w:p>
+    <w:p>
+      <w:r>
+        <w:t>There's one from an August night that says only: *Priya asked if I was all right and I said yes and she believed me, which is the most frightening thing that's happened to me this year.*</w:t>
+      </w:r>
+    </w:p>
+    <w:p>
+      <w:r>
+        <w:t>I remember that. I remember Priya asking. I remember saying yes.</w:t>
+      </w:r>
+    </w:p>
+    <w:p>
+      <w:r>
+        <w:t>I do not remember writing it down at four in the morning in a locker in a record shop, and both of those things are now true at once, and I have to sit with that.</w:t>
+      </w:r>
+    </w:p>
+    <w:p>
+      <w:r>
         <w:t>But the pattern underneath the grief is the thing.</w:t>
       </w:r>
     </w:p>
@@ -3172,6 +3947,56 @@
     <w:p>
       <w:r>
         <w:t>---</w:t>
+      </w:r>
+    </w:p>
+    <w:p>
+      <w:r>
+        <w:t>Before I go downstairs I do something I have been avoiding for eleven days, which is to look properly at my own flat.</w:t>
+      </w:r>
+    </w:p>
+    <w:p>
+      <w:r>
+        <w:t>Not tidy it. Search it.</w:t>
+      </w:r>
+    </w:p>
+    <w:p>
+      <w:r>
+        <w:t>I start in the wardrobe because that is where I put things I can't look at, and the box of photographs is where I left it in January of last year, and under the box there is a carrier bag I do not recognise.</w:t>
+      </w:r>
+    </w:p>
+    <w:p>
+      <w:r>
+        <w:t>Inside the carrier bag: an Ordnance Survey map of the area, folded to the Kesselwood sheet, with a biro ring round the bend. A head torch, still in its packaging, bought from a shop on the retail park according to the sticker. A pair of walking boots, size six, mine, muddy, which I have never owned.</w:t>
+      </w:r>
+    </w:p>
+    <w:p>
+      <w:r>
+        <w:t>I sit on the bedroom floor with a pair of boots I bought and wore and cleaned nothing off.</w:t>
+      </w:r>
+    </w:p>
+    <w:p>
+      <w:r>
+        <w:t>The receipt is in the boot. Fourteenth of March last year, 04:51, twenty-four-hour supermarket on the ring road.</w:t>
+      </w:r>
+    </w:p>
+    <w:p>
+      <w:r>
+        <w:t>Ten to five in the morning. I would have been asleep. I was asleep — that's a Tuesday, I know it's a Tuesday because I did four nights that week and Wednesday was my first off, and I would have got home at seven on the Tuesday morning and gone to bed.</w:t>
+      </w:r>
+    </w:p>
+    <w:p>
+      <w:r>
+        <w:t>Except at ten to five I was in a supermarket on the ring road buying walking boots with my own bank card.</w:t>
+      </w:r>
+    </w:p>
+    <w:p>
+      <w:r>
+        <w:t>I check the statement on my phone, standing in the bedroom.</w:t>
+      </w:r>
+    </w:p>
+    <w:p>
+      <w:r>
+        <w:t>It's there. £34.99. I have looked at that statement eleven times in fourteen months and never once queried a thirty-five pound transaction, because who queries thirty-five pounds.</w:t>
       </w:r>
     </w:p>
     <w:p>
@@ -3410,6 +4235,31 @@
     </w:p>
     <w:p>
       <w:r>
+        <w:t>"Say it out loud, then. How it sounds."</w:t>
+      </w:r>
+    </w:p>
+    <w:p>
+      <w:r>
+        <w:t>He doesn't dodge.</w:t>
+      </w:r>
+    </w:p>
+    <w:p>
+      <w:r>
+        <w:t>"It sounds like a man who developed a fixation on a bereaved woman and engineered proximity to her." He holds my eyes while he says it, which costs him. "It sounds like the first four minutes of a documentary. I'm aware that if you told this to any sensible person, the sensible person would tell you to move house."</w:t>
+      </w:r>
+    </w:p>
+    <w:p>
+      <w:r>
+        <w:t>"And what would you say to the sensible person?"</w:t>
+      </w:r>
+    </w:p>
+    <w:p>
+      <w:r>
+        <w:t>"I'd say they were probably right and I'd do it again." He turns the mug. "There's no version of this where I come out of it looking like someone with good judgement. There's only the version where you were on that road at half two in the morning and somebody knew, and the version where you were on that road at half two in the morning and nobody did."</w:t>
+      </w:r>
+    </w:p>
+    <w:p>
+      <w:r>
         <w:t>"It sounds insane."</w:t>
       </w:r>
     </w:p>
@@ -3541,6 +4391,56 @@
     <w:p>
       <w:r>
         <w:t>"There was," he says. "She showed me the screen. She'd already sent it."</w:t>
+      </w:r>
+    </w:p>
+    <w:p>
+      <w:r>
+        <w:t>I get my phone out and I go to her thread, which I have not deleted and will not delete, and I scroll to December.</w:t>
+      </w:r>
+    </w:p>
+    <w:p>
+      <w:r>
+        <w:t>The last message from Nina is dated the eleventh. *thanks for tonight. sorry i was weird. see you at mums xx*</w:t>
+      </w:r>
+    </w:p>
+    <w:p>
+      <w:r>
+        <w:t>Then nothing. Then the twelfth, thirteenth, and on the fourteenth, at 21:04, one message.</w:t>
+      </w:r>
+    </w:p>
+    <w:p>
+      <w:r>
+        <w:t>From me.</w:t>
+      </w:r>
+    </w:p>
+    <w:p>
+      <w:r>
+        <w:t>Just: *?*</w:t>
+      </w:r>
+    </w:p>
+    <w:p>
+      <w:r>
+        <w:t>A question mark, sent by me to my sister at four minutes past nine on the night she died, in reply to nothing.</w:t>
+      </w:r>
+    </w:p>
+    <w:p>
+      <w:r>
+        <w:t>Adrian looks at the screen for a long time.</w:t>
+      </w:r>
+    </w:p>
+    <w:p>
+      <w:r>
+        <w:t>"That's an answer to something," he says quietly.</w:t>
+      </w:r>
+    </w:p>
+    <w:p>
+      <w:r>
+        <w:t>"There's nothing above it."</w:t>
+      </w:r>
+    </w:p>
+    <w:p>
+      <w:r>
+        <w:t>"No," he says. "There isn't now."</w:t>
       </w:r>
     </w:p>
     <w:p>
@@ -3564,6 +4464,51 @@
     </w:p>
     <w:p>
       <w:r>
+        <w:t>I don't sleep for two days after the corridor.</w:t>
+      </w:r>
+    </w:p>
+    <w:p>
+      <w:r>
+        <w:t>Not from fear — I want to be accurate about this, because it would be a tidier book if I'd been frightened. What I feel is something closer to professional embarrassment, which I recognise as absurd even at the time.</w:t>
+      </w:r>
+    </w:p>
+    <w:p>
+      <w:r>
+        <w:t>I have spent eleven years assessing other people's cognition. I have a laminated card in my bag with the abbreviated mental test on it. I have sat opposite families and explained, kindly, that the man they are describing is not "having a funny turn," he is exhibiting a symptom, and that symptoms are things you take to a doctor.</w:t>
+      </w:r>
+    </w:p>
+    <w:p>
+      <w:r>
+        <w:t>And here is a woman in a corridor on a closed floor for six minutes and eleven seconds, and I have told the security guard it was a smell.</w:t>
+      </w:r>
+    </w:p>
+    <w:p>
+      <w:r>
+        <w:t>On the second afternoon I get as far as the GP surgery car park.</w:t>
+      </w:r>
+    </w:p>
+    <w:p>
+      <w:r>
+        <w:t>I sit there for twenty minutes with the engine off. I have the appointment. I made it on the phone that morning, and the receptionist asked what it was regarding and I said *sleep*, which was true and which was the smallest possible true thing I could have said.</w:t>
+      </w:r>
+    </w:p>
+    <w:p>
+      <w:r>
+        <w:t>And then I think about what happens if I go in and say the rest of it.</w:t>
+      </w:r>
+    </w:p>
+    <w:p>
+      <w:r>
+        <w:t>Because I know the pathway. I *am* the pathway. You disclose parasomnia with amnesia and confusional arousal to a GP, and if you're lucky you get a sleep clinic referral in nine months. And if you're unlucky — if the GP is thorough, if they ask the right question about your driving — there is a form, and the form goes to the DVLA, and my licence is my job.</w:t>
+      </w:r>
+    </w:p>
+    <w:p>
+      <w:r>
+        <w:t>I drive home without going in.</w:t>
+      </w:r>
+    </w:p>
+    <w:p>
+      <w:r>
         <w:t>I buy the camera that afternoon.</w:t>
       </w:r>
     </w:p>
@@ -3655,6 +4600,21 @@
     <w:p>
       <w:r>
         <w:t>**03:26, 03:31, 03:35.** Empty room, empty room, empty room.</w:t>
+      </w:r>
+    </w:p>
+    <w:p>
+      <w:r>
+        <w:t>I watch the empty room clips anyway. All five of them. Twenty-two minutes of an unmade bed in infrared, at half six in the morning, sitting on the edge of a bath.</w:t>
+      </w:r>
+    </w:p>
+    <w:p>
+      <w:r>
+        <w:t>I don't know what I think I'm going to see. That's not true — I do know. I think I'm going to see somebody else come into the room.</w:t>
+      </w:r>
+    </w:p>
+    <w:p>
+      <w:r>
+        <w:t>Nobody comes into the room. It's a bed with a duvet thrown back and a dent in the pillow, and a clock radio, and the corner of a wardrobe, and nothing moves for twenty-two minutes except the timestamp.</w:t>
       </w:r>
     </w:p>
     <w:p>
@@ -3928,6 +4888,46 @@
     </w:p>
     <w:p>
       <w:r>
+        <w:t>Denise has me in the office before I start.</w:t>
+      </w:r>
+    </w:p>
+    <w:p>
+      <w:r>
+        <w:t>"Occupational health," she says, sliding a form across. "Not a punishment. It's what I'd do for anyone who'd been off with what you've been off with."</w:t>
+      </w:r>
+    </w:p>
+    <w:p>
+      <w:r>
+        <w:t>"I've been off four days."</w:t>
+      </w:r>
+    </w:p>
+    <w:p>
+      <w:r>
+        <w:t>"You've been off four days *this time*." She doesn't blink. "Elena, you've done four hundred and eleven nights in the last two years. I ran it this morning because I wanted the number before I sat down with you." She taps the desk. "Four hundred and eleven. That's not a rota, that's a person hiding."</w:t>
+      </w:r>
+    </w:p>
+    <w:p>
+      <w:r>
+        <w:t>I look at the form.</w:t>
+      </w:r>
+    </w:p>
+    <w:p>
+      <w:r>
+        <w:t>"There's something I want to say and then I'll shut up," Denise says. "When your sister died I gave you three weeks and you took eight days, and I let you come back because we were short and because you told me work was the only thing holding you together, and I believed you because it was convenient for me to believe you."</w:t>
+      </w:r>
+    </w:p>
+    <w:p>
+      <w:r>
+        <w:t>She's not looking at me now. She's looking at the wall.</w:t>
+      </w:r>
+    </w:p>
+    <w:p>
+      <w:r>
+        <w:t>"That was two years ago and I've thought about it a lot," she says. "So this time you're going to fill in the form."</w:t>
+      </w:r>
+    </w:p>
+    <w:p>
+      <w:r>
         <w:t>I don't go to room 12.</w:t>
       </w:r>
     </w:p>
@@ -4109,6 +5109,41 @@
     <w:p>
       <w:r>
         <w:t>---</w:t>
+      </w:r>
+    </w:p>
+    <w:p>
+      <w:r>
+        <w:t>I stay with her while she cries, because that is the job and because I did this to her.</w:t>
+      </w:r>
+    </w:p>
+    <w:p>
+      <w:r>
+        <w:t>I want that written down plainly. I went into the room of an eighty-two-year-old woman with dementia at ten past two in the morning and I pushed her, deliberately, past the point where I could see it was distressing her, because I wanted something she had.</w:t>
+      </w:r>
+    </w:p>
+    <w:p>
+      <w:r>
+        <w:t>There is a version of me — the one who has done this job for eleven years, the one who trains new starters and tells them that a person with dementia is a person first — who would have stopped at the second question.</w:t>
+      </w:r>
+    </w:p>
+    <w:p>
+      <w:r>
+        <w:t>I did not stop at the second question. I asked eleven.</w:t>
+      </w:r>
+    </w:p>
+    <w:p>
+      <w:r>
+        <w:t>She settles eventually. She always settles; she has been settling for eighty-two years, through a war she doesn't remember and a husband she does. She asks about Roberto. I tell her about the car.</w:t>
+      </w:r>
+    </w:p>
+    <w:p>
+      <w:r>
+        <w:t>And then she takes my hand, in the dark, and says something in a small ordinary voice that is worse than any of it.</w:t>
+      </w:r>
+    </w:p>
+    <w:p>
+      <w:r>
+        <w:t>She says: "You're a good girl for coming down."</w:t>
       </w:r>
     </w:p>
     <w:p>
@@ -4277,6 +5312,36 @@
     </w:p>
     <w:p>
       <w:r>
+        <w:t>On the third afternoon I ring Denise and resign.</w:t>
+      </w:r>
+    </w:p>
+    <w:p>
+      <w:r>
+        <w:t>I don't plan it. I ring to say I need more time and what comes out is *I'm handing in my notice*, and Denise says "Elena, no, don't do this on a Wednesday," which is one of the wisest things anybody says to me in the whole of that year, and I say it's already done.</w:t>
+      </w:r>
+    </w:p>
+    <w:p>
+      <w:r>
+        <w:t>The reason is not the suspension. The reason is that on the fourth of the four nights I could not remember, standing in my kitchen, whether I had given Mr. Osei his eight o'clock or only thought about giving it.</w:t>
+      </w:r>
+    </w:p>
+    <w:p>
+      <w:r>
+        <w:t>I hadn't been at work. I hadn't been at work in six days. It didn't matter: for about ninety seconds I could not establish it, and I stood there with a glass in my hand doing the arithmetic, and the thing that frightened me was not the confusion.</w:t>
+      </w:r>
+    </w:p>
+    <w:p>
+      <w:r>
+        <w:t>It was how calm I was while I did it.</w:t>
+      </w:r>
+    </w:p>
+    <w:p>
+      <w:r>
+        <w:t>An hour later I sent the email. Eleven years. Two paragraphs.</w:t>
+      </w:r>
+    </w:p>
+    <w:p>
+      <w:r>
         <w:t>Day four he sits on the arm of my sofa at four in the afternoon in the dark with the blind down and says, "I'm going to say the thing now."</w:t>
       </w:r>
     </w:p>
@@ -4348,6 +5413,46 @@
     <w:p>
       <w:r>
         <w:t>And I still turn my head away from the corner by the bookshelf, because knowing what a thing is does not stop you from having to be in a room with it.</w:t>
+      </w:r>
+    </w:p>
+    <w:p>
+      <w:r>
+        <w:t>Somewhere in the third night I go looking for the list.</w:t>
+      </w:r>
+    </w:p>
+    <w:p>
+      <w:r>
+        <w:t>*Groceries.* Forty-one items. The things that didn't sit right.</w:t>
+      </w:r>
+    </w:p>
+    <w:p>
+      <w:r>
+        <w:t>It isn't there. Not deleted-and-recoverable, not in the archive — the note is gone, and the app tells me in its cheerful way that it was last edited eleven days ago, and eleven days ago is the night the voicemail arrived.</w:t>
+      </w:r>
+    </w:p>
+    <w:p>
+      <w:r>
+        <w:t>I stand in the kitchen at four in the morning and I understand that some version of me has closed the file.</w:t>
+      </w:r>
+    </w:p>
+    <w:p>
+      <w:r>
+        <w:t>Not hidden it. Closed it. The way you close a case: this is finished, there is nothing further to investigate, thank you for your time.</w:t>
+      </w:r>
+    </w:p>
+    <w:p>
+      <w:r>
+        <w:t>And I sit down on the kitchen floor with my back against the cupboard, and I say out loud, to an empty flat, in a voice that comes out much smaller than I intend:</w:t>
+      </w:r>
+    </w:p>
+    <w:p>
+      <w:r>
+        <w:t>"I don't want to know."</w:t>
+      </w:r>
+    </w:p>
+    <w:p>
+      <w:r>
+        <w:t>It's the first completely honest sentence I have said in fourteen months and there is nobody in the room to hear it.</w:t>
       </w:r>
     </w:p>
     <w:p>
@@ -4521,6 +5626,41 @@
     </w:p>
     <w:p>
       <w:r>
+        <w:t>I sleep four hours in my own bed with my shoes off and my coat on, and I dream about nothing at all, which is its own kind of mercy.</w:t>
+      </w:r>
+    </w:p>
+    <w:p>
+      <w:r>
+        <w:t>When I wake up there is a text from Adrian that says *saw the car back at 5. not asking. here if.*</w:t>
+      </w:r>
+    </w:p>
+    <w:p>
+      <w:r>
+        <w:t>Nine words. I read them about six times.</w:t>
+      </w:r>
+    </w:p>
+    <w:p>
+      <w:r>
+        <w:t>Here is a thing I have not said, because it has taken me until now to work out how to say it: at every point in this, from the parcel on the doorstep onwards, Adrian Cole gave me an exit.</w:t>
+      </w:r>
+    </w:p>
+    <w:p>
+      <w:r>
+        <w:t>*That's a no said politely, and I respect it.* *If it's that, we stop.* *Not asking.*</w:t>
+      </w:r>
+    </w:p>
+    <w:p>
+      <w:r>
+        <w:t>I have spent four months treating that as a technique — the patience of a man managing me. And lying on a bed at eight in the morning in a coat, it occurs to me for the first time that it might simply be what it looks like, which is a person being careful with someone.</w:t>
+      </w:r>
+    </w:p>
+    <w:p>
+      <w:r>
+        <w:t>I have got very bad at telling the difference. That's what fourteen months of this does: everybody's kindness starts to look like a move.</w:t>
+      </w:r>
+    </w:p>
+    <w:p>
+      <w:r>
         <w:t>Okonjo calls at nine.</w:t>
       </w:r>
     </w:p>
@@ -4752,6 +5892,61 @@
     <w:p>
       <w:r>
         <w:t>"It's you," Okonjo says, "trying to tell you something you can't hear while you're awake."</w:t>
+      </w:r>
+    </w:p>
+    <w:p>
+      <w:r>
+        <w:t>I sit with my hands flat on a table covered in paper that describes six hours of my own life that I cannot account for.</w:t>
+      </w:r>
+    </w:p>
+    <w:p>
+      <w:r>
+        <w:t>"I want to ask you something," I say, "and I want the police answer, not the kind one."</w:t>
+      </w:r>
+    </w:p>
+    <w:p>
+      <w:r>
+        <w:t>"Go on."</w:t>
+      </w:r>
+    </w:p>
+    <w:p>
+      <w:r>
+        <w:t>"If it turns out I was there. On that road. If that's what this is." I make myself finish it. "What happens to me?"</w:t>
+      </w:r>
+    </w:p>
+    <w:p>
+      <w:r>
+        <w:t>Okonjo does not soften it, which is the only reason I can hear it.</w:t>
+      </w:r>
+    </w:p>
+    <w:p>
+      <w:r>
+        <w:t>"Depends entirely on what you did. Being on a road isn't an offence. Being a passenger isn't an offence. Failing to report a collision can be, in some circumstances." She counts it off evenly. "Perverting the course of justice would be, if you'd lied to us in a statement — and you've never given a statement, which is a piece of luck I don't think you engineered."</w:t>
+      </w:r>
+    </w:p>
+    <w:p>
+      <w:r>
+        <w:t>"And if I stood there and didn't call anyone?"</w:t>
+      </w:r>
+    </w:p>
+    <w:p>
+      <w:r>
+        <w:t>The question sits in the middle of the table.</w:t>
+      </w:r>
+    </w:p>
+    <w:p>
+      <w:r>
+        <w:t>"There's no general offence of failing to help," she says. "Not in this country. Morally people find that unbearable and legally it's the position." A pause. "If a court ever heard about a woman who did that, what they'd hear about first is the fourteen months afterwards. Judges are not stupid about grief. Neither am I."</w:t>
+      </w:r>
+    </w:p>
+    <w:p>
+      <w:r>
+        <w:t>"You're being kind."</w:t>
+      </w:r>
+    </w:p>
+    <w:p>
+      <w:r>
+        <w:t>"I'm being accurate," she says. "You'll notice I haven't said *it wasn't your fault*, and I'm not going to, because I don't know, and because you'd stop listening to me the second I did."</w:t>
       </w:r>
     </w:p>
     <w:p>
@@ -4815,7 +6010,92 @@
     </w:p>
     <w:p>
       <w:r>
+        <w:t>The ward is eleven beds and a corridor with a window at the end that looks at a car park, and I am the only person on it who has ever worked in a building like it, which turns out to matter more than I expect.</w:t>
+      </w:r>
+    </w:p>
+    <w:p>
+      <w:r>
+        <w:t>I know the rhythm. I know that the eight o'clock obs are late because the handover overran. I know why the drugs trolley stops at bed four for six minutes. I catch myself, on the second morning, standing up to help a woman called Jackie who has dropped her cardigan, and a nurse says "sit down, love, I've got it," and I sit down, and something in me falls over.</w:t>
+      </w:r>
+    </w:p>
+    <w:p>
+      <w:r>
+        <w:t>Being on the wrong side of it is not humbling. That's the word people use and it's wrong. It's *disorienting* — like hearing your own voice on a recording. All the same sounds, arranged for somebody else.</w:t>
+      </w:r>
+    </w:p>
+    <w:p>
+      <w:r>
+        <w:t>Jackie is sixty-one and has been here five weeks and tells me on the first day, without being asked, exactly what she's in for, in the flat manner of someone who has stopped finding it interesting.</w:t>
+      </w:r>
+    </w:p>
+    <w:p>
+      <w:r>
+        <w:t>"Are you going to tell me yours?" she says.</w:t>
+      </w:r>
+    </w:p>
+    <w:p>
+      <w:r>
+        <w:t>"No."</w:t>
+      </w:r>
+    </w:p>
+    <w:p>
+      <w:r>
+        <w:t>"Fair enough." She goes back to her puzzle book. "You will by Thursday."</w:t>
+      </w:r>
+    </w:p>
+    <w:p>
+      <w:r>
+        <w:t>I tell her on the Wednesday.</w:t>
+      </w:r>
+    </w:p>
+    <w:p>
+      <w:r>
         <w:t>On the fourth night I sleep six hours and wake up and cry for forty minutes in a bathroom with a plastic mirror, and a healthcare assistant called Marcus sits outside the door and says nothing and does not go away.</w:t>
+      </w:r>
+    </w:p>
+    <w:p>
+      <w:r>
+        <w:t>On the fifth day they let me walk in the garden, which is a rectangle of grass with a bench and a smoking area that everybody uses including the people who don't smoke, because it is the only place on the ward where you can have a conversation nobody writes down.</w:t>
+      </w:r>
+    </w:p>
+    <w:p>
+      <w:r>
+        <w:t>Jackie comes out with me and rolls a cigarette she doesn't light.</w:t>
+      </w:r>
+    </w:p>
+    <w:p>
+      <w:r>
+        <w:t>"Can I tell you the thing I've worked out in five weeks?" she says.</w:t>
+      </w:r>
+    </w:p>
+    <w:p>
+      <w:r>
+        <w:t>"Go on."</w:t>
+      </w:r>
+    </w:p>
+    <w:p>
+      <w:r>
+        <w:t>"Everybody in there is in for the same thing." She gestures at the building with the unlit roll-up. "Different names on the notes. Same thing underneath. Every single one of us is in here because there's something we can't say."</w:t>
+      </w:r>
+    </w:p>
+    <w:p>
+      <w:r>
+        <w:t>"That's a bit neat."</w:t>
+      </w:r>
+    </w:p>
+    <w:p>
+      <w:r>
+        <w:t>"It's completely neat and I don't care." She puts the cigarette behind her ear. "Mine's that I hated my mother. Twenty years of caring for her, wiping her, doing everything, and I hated her the entire time, and she died and I couldn't say it, and eventually I stopped being able to leave the house." She says it without drama, the way you'd list ingredients. "Six weeks of tablets and a woman called Deborah and all I actually needed was to say the sentence in a room with a person in it."</w:t>
+      </w:r>
+    </w:p>
+    <w:p>
+      <w:r>
+        <w:t>"And that worked?"</w:t>
+      </w:r>
+    </w:p>
+    <w:p>
+      <w:r>
+        <w:t>"Christ, no. I said it and I felt worse for a fortnight." Jackie laughs. "But then it was *out*, and once it's out you can look at it, and it turns out I hated her and loved her, which apparently is allowed, and nobody had ever told me that."</w:t>
       </w:r>
     </w:p>
     <w:p>
@@ -5124,6 +6404,41 @@
     </w:p>
     <w:p>
       <w:r>
+        <w:t>I want to put down what was actually said in the car, because for fourteen months the thing I could not hold was not the crash. It was this.</w:t>
+      </w:r>
+    </w:p>
+    <w:p>
+      <w:r>
+        <w:t>She said: "You've been waiting for this."</w:t>
+      </w:r>
+    </w:p>
+    <w:p>
+      <w:r>
+        <w:t>I said: "That's not fair."</w:t>
+      </w:r>
+    </w:p>
+    <w:p>
+      <w:r>
+        <w:t>She said: "You've been waiting two years for me to do something you could be right about."</w:t>
+      </w:r>
+    </w:p>
+    <w:p>
+      <w:r>
+        <w:t>And I said — and this is mine, this is the one I own, this is not the sentence an eighty-two-year-old woman heard through a hedge but the one that came before it —</w:t>
+      </w:r>
+    </w:p>
+    <w:p>
+      <w:r>
+        <w:t>I said: "I'd rather be right than go to your funeral."</w:t>
+      </w:r>
+    </w:p>
+    <w:p>
+      <w:r>
+        <w:t>Twelve words. In a car, at midnight, doing fifty, to a woman who had been crying since the ring road.</w:t>
+      </w:r>
+    </w:p>
+    <w:p>
+      <w:r>
         <w:t>By then the argument had turned. She was crying and driving, which is worse than either. I said pull over. She pulled over hard, on the verge by the hedge, and put the hazards on.</w:t>
       </w:r>
     </w:p>
@@ -5220,6 +6535,46 @@
     <w:p>
       <w:r>
         <w:t>I stood there for a while.</w:t>
+      </w:r>
+    </w:p>
+    <w:p>
+      <w:r>
+        <w:t>People will want to know why, and I have had two years and a great deal of professional help, and the honest answer is in three parts and none of them is good enough.</w:t>
+      </w:r>
+    </w:p>
+    <w:p>
+      <w:r>
+        <w:t>The first is that I could see the roof of the car and the angle of it and the way the water was moving around it, and I have been a nurse for eleven years and I knew. Not hoped. Knew.</w:t>
+      </w:r>
+    </w:p>
+    <w:p>
+      <w:r>
+        <w:t>The second is that the bank was steep and wet and dark and I was alone, and there is a calculation you are taught in every first-aid course ever written which is *do not become the second casualty*, and I have taught that calculation to other people, and I performed it, correctly, in about four seconds, standing at a barrier looking at my sister's car.</w:t>
+      </w:r>
+    </w:p>
+    <w:p>
+      <w:r>
+        <w:t>The third is the one I could not hold.</w:t>
+      </w:r>
+    </w:p>
+    <w:p>
+      <w:r>
+        <w:t>The third is that in the moment I stood at that barrier, some part of me — small, fast, and entirely real — was aware that if I called 999 I would have to say who I was and where I had been and why I had got out of the car.</w:t>
+      </w:r>
+    </w:p>
+    <w:p>
+      <w:r>
+        <w:t>I want to be exact, because being exact is all I have. I do not think I decided not to call in order to protect myself. It was not that clean, and I would almost prefer it if it had been.</w:t>
+      </w:r>
+    </w:p>
+    <w:p>
+      <w:r>
+        <w:t>I think I stood at a barrier in the dark and became, for about eleven minutes, a person who could not act, because acting in any direction meant saying the sentence out loud.</w:t>
+      </w:r>
+    </w:p>
+    <w:p>
+      <w:r>
+        <w:t>*She asked me to stay in the car and I got out.*</w:t>
       </w:r>
     </w:p>
     <w:p>
@@ -5343,6 +6698,61 @@
     </w:p>
     <w:p>
       <w:r>
+        <w:t>I sit with my hands in my lap in a small room with a box of tissues nobody has touched.</w:t>
+      </w:r>
+    </w:p>
+    <w:p>
+      <w:r>
+        <w:t>"I keep waiting for you to be different with me," I say.</w:t>
+      </w:r>
+    </w:p>
+    <w:p>
+      <w:r>
+        <w:t>"Different how?"</w:t>
+      </w:r>
+    </w:p>
+    <w:p>
+      <w:r>
+        <w:t>"Colder. Now that you know." I look up. "I told you I stood at a barrier and watched and did nothing. You've written it down. And you're sitting there the same as you sat there in February when you thought I was a tired woman looking for a door."</w:t>
+      </w:r>
+    </w:p>
+    <w:p>
+      <w:r>
+        <w:t>Okonjo takes a moment.</w:t>
+      </w:r>
+    </w:p>
+    <w:p>
+      <w:r>
+        <w:t>"Do you want the professional answer or the other one?"</w:t>
+      </w:r>
+    </w:p>
+    <w:p>
+      <w:r>
+        <w:t>"The other one."</w:t>
+      </w:r>
+    </w:p>
+    <w:p>
+      <w:r>
+        <w:t>"I've been doing this twenty-six years," she says. "In that time I have met perhaps nine people who did something genuinely cruel. Nine. Everybody else was frightened, or drunk, or twenty-two, or standing somewhere they couldn't cope with being." She puts her pen down. "You stood at a barrier for eleven minutes. I've met a man who drove home from a hit-and-run and had his tea. You are not in the same category as that man, and I've been at this long enough to know the difference at a glance, and I'd rather say so out loud than let you sit there constructing a version of me that's disgusted with you."</w:t>
+      </w:r>
+    </w:p>
+    <w:p>
+      <w:r>
+        <w:t>I look at the tissues.</w:t>
+      </w:r>
+    </w:p>
+    <w:p>
+      <w:r>
+        <w:t>"I'd built one," I admit.</w:t>
+      </w:r>
+    </w:p>
+    <w:p>
+      <w:r>
+        <w:t>"Course you had," she says. "You've been building one of everybody for two years."</w:t>
+      </w:r>
+    </w:p>
+    <w:p>
+      <w:r>
         <w:t>---</w:t>
       </w:r>
     </w:p>
@@ -5388,6 +6798,71 @@
     </w:p>
     <w:p>
       <w:r>
+        <w:t>I look at the day room carpet, which is the colour of nothing.</w:t>
+      </w:r>
+    </w:p>
+    <w:p>
+      <w:r>
+        <w:t>"Nine months," I say.</w:t>
+      </w:r>
+    </w:p>
+    <w:p>
+      <w:r>
+        <w:t>"Yes."</w:t>
+      </w:r>
+    </w:p>
+    <w:p>
+      <w:r>
+        <w:t>"I spoke to her probably three hundred times in those nine months."</w:t>
+      </w:r>
+    </w:p>
+    <w:p>
+      <w:r>
+        <w:t>"I know."</w:t>
+      </w:r>
+    </w:p>
+    <w:p>
+      <w:r>
+        <w:t>"We went to Whitby in August. We spent four days in a caravan. She was on her phone constantly and I took the piss out of her for it and she said it was work." I hear my own voice doing something unpleasant. "It was you."</w:t>
+      </w:r>
+    </w:p>
+    <w:p>
+      <w:r>
+        <w:t>"It was me."</w:t>
+      </w:r>
+    </w:p>
+    <w:p>
+      <w:r>
+        <w:t>"Did she—" I stop, and make myself ask the real one. "Did she say why she wasn't telling me?"</w:t>
+      </w:r>
+    </w:p>
+    <w:p>
+      <w:r>
+        <w:t>Adrian is quiet for a moment.</w:t>
+      </w:r>
+    </w:p>
+    <w:p>
+      <w:r>
+        <w:t>"She said you'd be disappointed in her," he says. "Not angry. Disappointed. She said anger she could work with and disappointment was the other thing." He turns his hands over. "And she said — and I've thought about whether to tell you this for four months — she said *El thinks I'm the one who gets away with things.*"</w:t>
+      </w:r>
+    </w:p>
+    <w:p>
+      <w:r>
+        <w:t>The room hums.</w:t>
+      </w:r>
+    </w:p>
+    <w:p>
+      <w:r>
+        <w:t>"She wasn't wrong," I say.</w:t>
+      </w:r>
+    </w:p>
+    <w:p>
+      <w:r>
+        <w:t>"No," says Adrian. "She wasn't."</w:t>
+      </w:r>
+    </w:p>
+    <w:p>
+      <w:r>
         <w:t>The day room hums.</w:t>
       </w:r>
     </w:p>
@@ -5509,6 +6984,81 @@
     <w:p>
       <w:r>
         <w:t>And I say: "Mum. I need to tell you where I was that night."</w:t>
+      </w:r>
+    </w:p>
+    <w:p>
+      <w:r>
+        <w:t>There is a silence on the line of a particular length.</w:t>
+      </w:r>
+    </w:p>
+    <w:p>
+      <w:r>
+        <w:t>"Right," my mother says. "Hang on. I'm going to sit down."</w:t>
+      </w:r>
+    </w:p>
+    <w:p>
+      <w:r>
+        <w:t>I hear her sit down. I hear the chair in the hall, the one nobody sits in, the one by the telephone table that has been there since 1994.</w:t>
+      </w:r>
+    </w:p>
+    <w:p>
+      <w:r>
+        <w:t>"Go on then," she says.</w:t>
+      </w:r>
+    </w:p>
+    <w:p>
+      <w:r>
+        <w:t>And I tell her. All of it, in order, in a day room with terrible chairs, while a man two hundred miles into his own guilt waits in the car park because I asked him to.</w:t>
+      </w:r>
+    </w:p>
+    <w:p>
+      <w:r>
+        <w:t>It takes eleven minutes.</w:t>
+      </w:r>
+    </w:p>
+    <w:p>
+      <w:r>
+        <w:t>When I finish, my mother is quiet for long enough that I check the screen to see if the call has dropped.</w:t>
+      </w:r>
+    </w:p>
+    <w:p>
+      <w:r>
+        <w:t>Then she says: "Was she frightened?"</w:t>
+      </w:r>
+    </w:p>
+    <w:p>
+      <w:r>
+        <w:t>Of all the questions.</w:t>
+      </w:r>
+    </w:p>
+    <w:p>
+      <w:r>
+        <w:t>"I don't know," I say. "I don't have the last four minutes. I don't think I ever will."</w:t>
+      </w:r>
+    </w:p>
+    <w:p>
+      <w:r>
+        <w:t>"No," my mother says. "Well."</w:t>
+      </w:r>
+    </w:p>
+    <w:p>
+      <w:r>
+        <w:t>Another silence.</w:t>
+      </w:r>
+    </w:p>
+    <w:p>
+      <w:r>
+        <w:t>"I knew she'd been drinking," she says. "The police told me at the time and I've never said it out loud to a single person, not to you, not to your uncle, not to anybody at the funeral. Two years." Her voice does not break; my mother's voice does not break, it just gets very flat, which is worse. "I've let people think it was the road."</w:t>
+      </w:r>
+    </w:p>
+    <w:p>
+      <w:r>
+        <w:t>"Mum—"</w:t>
+      </w:r>
+    </w:p>
+    <w:p>
+      <w:r>
+        <w:t>"So there's two of us, then," she says. "Sitting on it."</w:t>
       </w:r>
     </w:p>
     <w:p>
@@ -5632,7 +7182,97 @@
     </w:p>
     <w:p>
       <w:r>
+        <w:t>She finishes her tea.</w:t>
+      </w:r>
+    </w:p>
+    <w:p>
+      <w:r>
+        <w:t>"There's a thing I've been going to say to you for a month and I keep not saying it, so I'll say it now while I've still got the warrant card." She sets the cup down. "You're going to spend the next few years deciding what kind of story this was. Everybody does. And there are two on offer.</w:t>
+      </w:r>
+    </w:p>
+    <w:p>
+      <w:r>
+        <w:t>"One is: a woman got out of a car in temper and her sister died and she hid it for fourteen months.</w:t>
+      </w:r>
+    </w:p>
+    <w:p>
+      <w:r>
+        <w:t>"The other is: a woman who could not remember something spent fourteen months, at four in the morning, in the cold, driving to the place it happened and writing it down, until she made herself find out. At enormous cost. When absolutely nobody was making her."</w:t>
+      </w:r>
+    </w:p>
+    <w:p>
+      <w:r>
+        <w:t>I look at her.</w:t>
+      </w:r>
+    </w:p>
+    <w:p>
+      <w:r>
+        <w:t>"Both of those are accurate," Okonjo says. "I've read the file. They're the same set of facts. You'll pick one and you'll live inside it, and I'd like to be on record as having told you that the second one is also true, because in about eighteen months you'll have forgotten anybody ever said it."</w:t>
+      </w:r>
+    </w:p>
+    <w:p>
+      <w:r>
         <w:t>---</w:t>
+      </w:r>
+    </w:p>
+    <w:p>
+      <w:r>
+        <w:t>There is one thing in the notebook that Okonjo asks me about directly, in the café, before she hands it over.</w:t>
+      </w:r>
+    </w:p>
+    <w:p>
+      <w:r>
+        <w:t>"Page fifty-three," she says. "I need to ask, and then I'll never ask again."</w:t>
+      </w:r>
+    </w:p>
+    <w:p>
+      <w:r>
+        <w:t>I know the page. Everybody who has read the notebook knows the page.</w:t>
+      </w:r>
+    </w:p>
+    <w:p>
+      <w:r>
+        <w:t>It's from the twelfth of November, three months before it all came apart, and it says:</w:t>
+      </w:r>
+    </w:p>
+    <w:p>
+      <w:r>
+        <w:t>&gt; *If I can't get there by December I'll do the other thing. I've thought about the other thing enough now that it's not frightening, which is how you know.*</w:t>
+      </w:r>
+    </w:p>
+    <w:p>
+      <w:r>
+        <w:t>"Were you planning to kill yourself?" Okonjo says.</w:t>
+      </w:r>
+    </w:p>
+    <w:p>
+      <w:r>
+        <w:t>The café does its noise around us.</w:t>
+      </w:r>
+    </w:p>
+    <w:p>
+      <w:r>
+        <w:t>"I don't know," I say. "That's the honest answer and I've had it out with Priti four times. I don't remember writing it. I don't remember thinking it." I turn the cup. "But I read it and I don't feel like it belongs to a stranger, which is the bit that frightens me."</w:t>
+      </w:r>
+    </w:p>
+    <w:p>
+      <w:r>
+        <w:t>"Have you told your doctor?"</w:t>
+      </w:r>
+    </w:p>
+    <w:p>
+      <w:r>
+        <w:t>"Day two on the ward. It's in my notes. There's a plan and there's a number and I've used it once."</w:t>
+      </w:r>
+    </w:p>
+    <w:p>
+      <w:r>
+        <w:t>Okonjo nods slowly.</w:t>
+      </w:r>
+    </w:p>
+    <w:p>
+      <w:r>
+        <w:t>"Good," she says, and that's all, and she never asks again, and I find out about eleven months later — from a nurse on a completely unrelated ward, of all places — that she rang Dr. Iyer's team the day she read it, before she ever raised it with me.</w:t>
       </w:r>
     </w:p>
     <w:p>
@@ -5886,6 +7526,91 @@
     </w:p>
     <w:p>
       <w:r>
+        <w:t>She dies in March, of pneumonia, which is what most of them die of in the end whatever it says on the form.</w:t>
+      </w:r>
+    </w:p>
+    <w:p>
+      <w:r>
+        <w:t>Denise rings to tell me, which she did not have to do and which I understand is a kindness aimed at both of us.</w:t>
+      </w:r>
+    </w:p>
+    <w:p>
+      <w:r>
+        <w:t>There are nine people at the funeral. Four are staff from Ridgemont on their day off. There is no family. The celebrant reads out a life in six minutes — born in Naples in 1943, came to England at nineteen, married Roberto in 1966, forty-one years at Kesselwood Cottages, no children — and gets her name wrong twice, and nobody corrects him, because there is nobody there whose job it is to.</w:t>
+      </w:r>
+    </w:p>
+    <w:p>
+      <w:r>
+        <w:t>I stand at the back like a guitar teacher.</w:t>
+      </w:r>
+    </w:p>
+    <w:p>
+      <w:r>
+        <w:t>Afterwards, in the car park, Priya finds me. She's in a black coat that doesn't fit her and she looks about nineteen.</w:t>
+      </w:r>
+    </w:p>
+    <w:p>
+      <w:r>
+        <w:t>"You left," she says. "You just — email."</w:t>
+      </w:r>
+    </w:p>
+    <w:p>
+      <w:r>
+        <w:t>"I know."</w:t>
+      </w:r>
+    </w:p>
+    <w:p>
+      <w:r>
+        <w:t>"I thought I'd done something."</w:t>
+      </w:r>
+    </w:p>
+    <w:p>
+      <w:r>
+        <w:t>That lands somewhere it will stay for a while.</w:t>
+      </w:r>
+    </w:p>
+    <w:p>
+      <w:r>
+        <w:t>"You didn't do anything," I say. "You asked me if I was all right and I lied to you, and that was mine, not yours."</w:t>
+      </w:r>
+    </w:p>
+    <w:p>
+      <w:r>
+        <w:t>She thinks about it.</w:t>
+      </w:r>
+    </w:p>
+    <w:p>
+      <w:r>
+        <w:t>"Are you all right now?"</w:t>
+      </w:r>
+    </w:p>
+    <w:p>
+      <w:r>
+        <w:t>And I stand in a crematorium car park in March and give a colleague of eleven years the first accurate answer I have given anybody in that building.</w:t>
+      </w:r>
+    </w:p>
+    <w:p>
+      <w:r>
+        <w:t>"No," I say. "But I'm being treated, and I'm sleeping, and I'll tell you the whole thing if you want it, but not here."</w:t>
+      </w:r>
+    </w:p>
+    <w:p>
+      <w:r>
+        <w:t>Priya nods slowly.</w:t>
+      </w:r>
+    </w:p>
+    <w:p>
+      <w:r>
+        <w:t>"There's a place on Farrow Street," she says. "Does coffee at hours that suit people who work nights."</w:t>
+      </w:r>
+    </w:p>
+    <w:p>
+      <w:r>
+        <w:t>---</w:t>
+      </w:r>
+    </w:p>
+    <w:p>
+      <w:r>
         <w:t>Okonjo retires in September. She tells me at a pub near the station, over a lemonade, having told me at the door that she's driving and that she'd have liked a pint.</w:t>
       </w:r>
     </w:p>
@@ -5972,6 +7697,51 @@
     <w:p>
       <w:r>
         <w:t>---</w:t>
+      </w:r>
+    </w:p>
+    <w:p>
+      <w:r>
+        <w:t>There's a hearing in August. Not a court — the nursing council, because Angela wrote it up as she said she would and because a registered nurse spending forty minutes questioning a resident with dementia at two in the morning is a thing that has to go somewhere.</w:t>
+      </w:r>
+    </w:p>
+    <w:p>
+      <w:r>
+        <w:t>I don't defend it. That surprises everybody including me.</w:t>
+      </w:r>
+    </w:p>
+    <w:p>
+      <w:r>
+        <w:t>I sit in a room with three people and a laptop and when they ask me to respond to the allegation I say: "It's accurate. I did that. She was distressed and I kept going because I wanted something from her."</w:t>
+      </w:r>
+    </w:p>
+    <w:p>
+      <w:r>
+        <w:t>The woman chairing it looks up.</w:t>
+      </w:r>
+    </w:p>
+    <w:p>
+      <w:r>
+        <w:t>"Do you want to tell us about the mitigating circumstances?"</w:t>
+      </w:r>
+    </w:p>
+    <w:p>
+      <w:r>
+        <w:t>"There are some," I say. "I'd rather they were in the notes than in my mouth."</w:t>
+      </w:r>
+    </w:p>
+    <w:p>
+      <w:r>
+        <w:t>They give me a caution and a condition: supervised practice for twelve months, and a return-to-work interview with occupational health before I take another post.</w:t>
+      </w:r>
+    </w:p>
+    <w:p>
+      <w:r>
+        <w:t>It is, by any measure, the lightest possible outcome, and I walk out into a car park in August feeling worse than when I went in, and it takes Priti about three sessions to get out of me why.</w:t>
+      </w:r>
+    </w:p>
+    <w:p>
+      <w:r>
+        <w:t>Which is: I had rather been hoping they'd strike me off.</w:t>
       </w:r>
     </w:p>
     <w:p>
@@ -6195,6 +7965,36 @@
     </w:p>
     <w:p>
       <w:r>
+        <w:t>I have thought since about what it cost to say it in that room rather than in a police station or a consulting room, and the answer is that a police station and a consulting room are places where people are paid to hear things.</w:t>
+      </w:r>
+    </w:p>
+    <w:p>
+      <w:r>
+        <w:t>Rachel from the school is not paid to hear it. My uncle is not paid to hear it. My mother's neighbour with a plate of sandwiches in her hand is not paid to hear it, and she is going to go home tonight and tell her husband, and by Tuesday four people in Bellhouse who knew my sister will know what I did.</w:t>
+      </w:r>
+    </w:p>
+    <w:p>
+      <w:r>
+        <w:t>That's the part. Not the saying. The Tuesday.</w:t>
+      </w:r>
+    </w:p>
+    <w:p>
+      <w:r>
+        <w:t>Dr. Iyer asked me, before I was discharged, what I was most afraid of, and I said *remembering*, and she said "you already remember," and I said fine, then, being charged with something.</w:t>
+      </w:r>
+    </w:p>
+    <w:p>
+      <w:r>
+        <w:t>And she said, "I don't think that's it either."</w:t>
+      </w:r>
+    </w:p>
+    <w:p>
+      <w:r>
+        <w:t>She was right. What I was afraid of is a room in Bellhouse on a Saturday in December with fourteen people in it who loved her, finding out that the last thing I said to her was *fine*.</w:t>
+      </w:r>
+    </w:p>
+    <w:p>
+      <w:r>
         <w:t>---</w:t>
       </w:r>
     </w:p>
@@ -6271,6 +8071,46 @@
     <w:p>
       <w:r>
         <w:t>"Yeah," I say. "She would."</w:t>
+      </w:r>
+    </w:p>
+    <w:p>
+      <w:r>
+        <w:t>Rachel picks up another plate.</w:t>
+      </w:r>
+    </w:p>
+    <w:p>
+      <w:r>
+        <w:t>"She talked about you all the time," she says. "You know that, don't you? Staff room, every Monday. *My sister the nurse.*" She dries carefully. "There was a thing in October, before — a kid in her class whose mum was in hospital, and Nina didn't know what to say to him, and she rang you at lunchtime from the corridor and asked you what happens on a ward, so she could tell him something true."</w:t>
+      </w:r>
+    </w:p>
+    <w:p>
+      <w:r>
+        <w:t>I stop with my hands in the water.</w:t>
+      </w:r>
+    </w:p>
+    <w:p>
+      <w:r>
+        <w:t>I remember that call. I was on a night rotation and asleep and I was short with her, and I told her about visiting hours and what the machines do and why they beep, and she said *thanks El* and rang off, and I went back to bed irritated.</w:t>
+      </w:r>
+    </w:p>
+    <w:p>
+      <w:r>
+        <w:t>"He's fine, by the way," Rachel says. "The kid. His mum's fine. He's in year six now and he's a nightmare."</w:t>
+      </w:r>
+    </w:p>
+    <w:p>
+      <w:r>
+        <w:t>We stand at the sink for a while.</w:t>
+      </w:r>
+    </w:p>
+    <w:p>
+      <w:r>
+        <w:t>"I didn't know she did that," I say.</w:t>
+      </w:r>
+    </w:p>
+    <w:p>
+      <w:r>
+        <w:t>"No," says Rachel. "Well. You were asleep."</w:t>
       </w:r>
     </w:p>
     <w:p>
@@ -6314,6 +8154,46 @@
     </w:p>
     <w:p>
       <w:r>
+        <w:t>Mr. Okafor's dog is called Sandra. He tells me this on the first visit with an entirely straight face and it takes me three weeks to work out he is not joking. Sandra is fourteen and arthritic and lies across his feet while I do the dressing, and the ulcer is going to close in about four months and both of us know it and neither of us says so, because saying so is how you jinx a thing.</w:t>
+      </w:r>
+    </w:p>
+    <w:p>
+      <w:r>
+        <w:t>The new one on Farrow Street is called Mrs. Adeyemi and she is not reluctant to engage, she is furious, which is different and which the notes did not say. She is furious because she is sixty-eight and has been sent home from a hospital that did not tell her what it had found, and nobody has explained anything to her in nine days.</w:t>
+      </w:r>
+    </w:p>
+    <w:p>
+      <w:r>
+        <w:t>So I sit down at her kitchen table and I explain it. All of it, twice, with a pen and the back of an envelope.</w:t>
+      </w:r>
+    </w:p>
+    <w:p>
+      <w:r>
+        <w:t>It takes forty minutes I do not have. There are meetings about this — about "capacity" and "visit duration" and a phrase I have come to hate, which is "scope of role."</w:t>
+      </w:r>
+    </w:p>
+    <w:p>
+      <w:r>
+        <w:t>I have started, in these meetings, to say things out loud.</w:t>
+      </w:r>
+    </w:p>
+    <w:p>
+      <w:r>
+        <w:t>That's new. For eleven years at Ridgemont I was the person who did the thing properly and said nothing about the fact that the thing was impossible. Now I put my hand up and say: *this is a forty-minute job and you've costed it at fifteen, and I'd like that written in the minutes.*</w:t>
+      </w:r>
+    </w:p>
+    <w:p>
+      <w:r>
+        <w:t>It doesn't change anything. It goes in the minutes.</w:t>
+      </w:r>
+    </w:p>
+    <w:p>
+      <w:r>
+        <w:t>Priti says this is what she means by *the wanting to not know* being the thing to watch — that the opposite of it isn't confessing, it's just saying ordinary true things at ordinary volume, on Thursdays, in rooms where it's inconvenient.</w:t>
+      </w:r>
+    </w:p>
+    <w:p>
+      <w:r>
         <w:t>---</w:t>
       </w:r>
     </w:p>
@@ -6334,6 +8214,26 @@
     </w:p>
     <w:p>
       <w:r>
+        <w:t>There are practical things, and nobody writes about the practical things, so I will.</w:t>
+      </w:r>
+    </w:p>
+    <w:p>
+      <w:r>
+        <w:t>I gave my car keys to Adrian for four months. Not symbolically — he kept them in his flat and I knocked on his door in the morning when I needed the car, which is humiliating for about three weeks and then becomes as ordinary as anything else.</w:t>
+      </w:r>
+    </w:p>
+    <w:p>
+      <w:r>
+        <w:t>There is a bolt on the inside of my front door, high up, at a height I have to consciously reach for. Dr. Iyer's suggestion. The theory is that a sleeping brain will do a familiar action and not an unfamiliar one, and the theory has held so far.</w:t>
+      </w:r>
+    </w:p>
+    <w:p>
+      <w:r>
+        <w:t>I do not work nights. That's permanent. It cost me eleven years of seniority and about six thousand a year, and it is not negotiable, and when the agency rings — they always ring, they are always short — I say no in the first sentence.</w:t>
+      </w:r>
+    </w:p>
+    <w:p>
+      <w:r>
         <w:t>Twice in the first year I woke up somewhere I didn't remember going. Once in the hall. Once in the car, on the drive, with the engine off and the keys in my lap.</w:t>
       </w:r>
     </w:p>
@@ -6375,6 +8275,31 @@
     <w:p>
       <w:r>
         <w:t>I stand at the barrier for a while.</w:t>
+      </w:r>
+    </w:p>
+    <w:p>
+      <w:r>
+        <w:t>The council put a sign up in the spring. SLOW — BEND. It is the third sign on that stretch and it will not make any difference to anybody, and I know because I sat in a room in February and asked for it, along with a request for the barrier to be extended forty metres, which was refused on cost.</w:t>
+      </w:r>
+    </w:p>
+    <w:p>
+      <w:r>
+        <w:t>I did that properly, in daylight, with a form. It took four months and two meetings and I was polite in both of them.</w:t>
+      </w:r>
+    </w:p>
+    <w:p>
+      <w:r>
+        <w:t>The sign is not for her. I want to be clear about that with myself, standing here, because it would be very easy to let it be a headstone and it isn't one; she has a headstone, in Bellhouse, and I go there too, and it says her name and two dates and *loved*.</w:t>
+      </w:r>
+    </w:p>
+    <w:p>
+      <w:r>
+        <w:t>The sign is for whoever comes round that bend at midnight next December.</w:t>
+      </w:r>
+    </w:p>
+    <w:p>
+      <w:r>
+        <w:t>That's the only useful thing I have found to do with any of it, in the end. It is embarrassingly small, like everything else that works.</w:t>
       </w:r>
     </w:p>
     <w:p>

</xml_diff>